<commit_message>
Rebuild six evidence-backed CVs and enforce editorial review
CV-only editorial refresh for Talmatic, SlotCatalog, Nova Digital, weBeetle, INFOBUS, and Recare. Include fresh terra_medium match judgments, canonical application receipts, and generated catalogs.

Validation: 489 unit tests passed (19 skipped); six CV draft validations; all six Word-rendered PDFs visually reviewed at two pages with 62 of 62 Experience bullets preserved in extracted PDF text.

Talmatic uses application-codex because its existing cv.docx is open in Word.
</commit_message>
<xml_diff>
--- a/registry/jobs/2026-09-23_070623_webeetle_developer/application/CV_ValentinNikolaev_webeetle_Developer.docx
+++ b/registry/jobs/2026-09-23_070623_webeetle_developer/application/CV_ValentinNikolaev_webeetle_Developer.docx
@@ -36,7 +36,7 @@
           <w:szCs w:val="24"/>
           <w:rtl w:val="false"/>
         </w:rPr>
-        <w:t xml:space="preserve">Backend Developer | PHP, Go and Production Integrations</w:t>
+        <w:t xml:space="preserve">Backend Developer | PHP, Symfony and Distributed Services</w:t>
       </w:r>
     </w:p>
     <w:p>
@@ -55,7 +55,7 @@
         </w:rPr>
         <w:t xml:space="preserve">Rome, Italy | </w:t>
       </w:r>
-      <w:hyperlink w:history="1" r:id="rIdquqg9zfg0wmodhwkzxnxg">
+      <w:hyperlink w:history="1" r:id="rIdv1_phyabh_i1hfhvxalsd">
         <w:r>
           <w:rPr>
             <w:rFonts w:ascii="Aptos" w:cs="Aptos" w:eastAsia="Aptos" w:hAnsi="Aptos"/>
@@ -99,7 +99,7 @@
         </w:rPr>
         <w:t xml:space="preserve">LinkedIn: </w:t>
       </w:r>
-      <w:hyperlink w:history="1" r:id="rIdf4poso0epbsseg8g5l4_d">
+      <w:hyperlink w:history="1" r:id="rIdyeuyi1hvispopb8oxi_rv">
         <w:r>
           <w:rPr>
             <w:rFonts w:ascii="Aptos" w:cs="Aptos" w:eastAsia="Aptos" w:hAnsi="Aptos"/>
@@ -122,7 +122,7 @@
         </w:rPr>
         <w:t xml:space="preserve"> | GitHub: </w:t>
       </w:r>
-      <w:hyperlink w:history="1" r:id="rIdaxczqgk_4ekfanafngxqr">
+      <w:hyperlink w:history="1" r:id="rIdxqaaqg0uyyh9yu0v9qyoz">
         <w:r>
           <w:rPr>
             <w:rFonts w:ascii="Aptos" w:cs="Aptos" w:eastAsia="Aptos" w:hAnsi="Aptos"/>
@@ -170,7 +170,7 @@
           <w:szCs w:val="24"/>
           <w:rtl w:val="false"/>
         </w:rPr>
-        <w:t xml:space="preserve">Backend developer with more than 15 years in Go and PHP production systems. I build privacy-sensitive backend services, integrations and operational workflows with a focus on clear system boundaries and reliable delivery. Recent work includes a PII/PHI-protected Amazon Connect platform, a multi-tenant Go gateway, event-driven PHP systems and SQL performance improvements.</w:t>
+        <w:t xml:space="preserve">Backend developer with 15+ years across PHP and Go production systems, including Laravel/Symfony services, relational data, REST integration and event-driven platforms. I focus on maintainable service boundaries, practical operational reliability and delivery from design to production. Recent experience covers a secure health-domain service, multi-tenant vendor integration, PHP analytics pipelines and database stability. I have also worked with Agile planning and shared service components. I bring practical backend depth to teams maintaining distributed REST services, with PHP service delivery and operational support experience.</w:t>
       </w:r>
     </w:p>
     <w:p>
@@ -242,17 +242,17 @@
           <w:szCs w:val="24"/>
           <w:rtl w:val="false"/>
         </w:rPr>
-        <w:t xml:space="preserve">Data and integration:</w:t>
-      </w:r>
-      <w:r>
-        <w:rPr>
-          <w:rFonts w:ascii="Aptos" w:cs="Aptos" w:eastAsia="Aptos" w:hAnsi="Aptos"/>
-          <w:color w:val="000000"/>
-          <w:sz w:val="24"/>
-          <w:szCs w:val="24"/>
-          <w:rtl w:val="false"/>
-        </w:rPr>
-        <w:t xml:space="preserve"> MySQL, PostgreSQL, REST APIs, EventBridge, queues, event-driven architecture, Intercom API, Zendesk API.</w:t>
+        <w:t xml:space="preserve">Data and services:</w:t>
+      </w:r>
+      <w:r>
+        <w:rPr>
+          <w:rFonts w:ascii="Aptos" w:cs="Aptos" w:eastAsia="Aptos" w:hAnsi="Aptos"/>
+          <w:color w:val="000000"/>
+          <w:sz w:val="24"/>
+          <w:szCs w:val="24"/>
+          <w:rtl w:val="false"/>
+        </w:rPr>
+        <w:t xml:space="preserve"> MySQL, PostgreSQL, REST APIs, queues, AWS EventBridge, event-driven systems, microservices.</w:t>
       </w:r>
       <w:r>
         <w:rPr>
@@ -275,17 +275,17 @@
           <w:szCs w:val="24"/>
           <w:rtl w:val="false"/>
         </w:rPr>
-        <w:t xml:space="preserve">Delivery and operations:</w:t>
-      </w:r>
-      <w:r>
-        <w:rPr>
-          <w:rFonts w:ascii="Aptos" w:cs="Aptos" w:eastAsia="Aptos" w:hAnsi="Aptos"/>
-          <w:color w:val="000000"/>
-          <w:sz w:val="24"/>
-          <w:szCs w:val="24"/>
-          <w:rtl w:val="false"/>
-        </w:rPr>
-        <w:t xml:space="preserve"> AWS, Kubernetes, CI/CD, monitoring, production troubleshooting, SQS.</w:t>
+        <w:t xml:space="preserve">Delivery:</w:t>
+      </w:r>
+      <w:r>
+        <w:rPr>
+          <w:rFonts w:ascii="Aptos" w:cs="Aptos" w:eastAsia="Aptos" w:hAnsi="Aptos"/>
+          <w:color w:val="000000"/>
+          <w:sz w:val="24"/>
+          <w:szCs w:val="24"/>
+          <w:rtl w:val="false"/>
+        </w:rPr>
+        <w:t xml:space="preserve"> AWS, Kubernetes, RabbitMQ, CI/CD, monitoring, logging, production reliability.</w:t>
       </w:r>
     </w:p>
     <w:p>
@@ -344,7 +344,7 @@
           <w:szCs w:val="24"/>
           <w:rtl w:val="false"/>
         </w:rPr>
-        <w:t xml:space="preserve">November 2023 – 2026</w:t>
+        <w:t xml:space="preserve">November 2023 – July 2026</w:t>
       </w:r>
     </w:p>
     <w:p>
@@ -365,7 +365,7 @@
           <w:szCs w:val="24"/>
           <w:rtl w:val="false"/>
         </w:rPr>
-        <w:t xml:space="preserve">Architected a health-domain Amazon Connect platform with PII/PHI protection as its starting point: phone numbers were server-resolved, masked in UI and logs, passed only as transient contact attributes and purged by TTL; formal security and recording-compliance reviews preceded production.</w:t>
+        <w:t xml:space="preserve">Delivered a privacy-first outbound-calling backend for a health-domain workflow; security and recording-compliance review cleared it for production.</w:t>
       </w:r>
     </w:p>
     <w:p>
@@ -386,7 +386,7 @@
           <w:szCs w:val="24"/>
           <w:rtl w:val="false"/>
         </w:rPr>
-        <w:t xml:space="preserve">Implemented backend-owned contact controls for timezones, holidays, do-not-call rules and opt-outs, setting Amazon Connect retries to zero so repeat calls could not bypass those safeguards.</w:t>
+        <w:t xml:space="preserve">Built policy controls for contact timing, holidays, opt-outs and do-not-call records, keeping customer outreach within defined safeguards.</w:t>
       </w:r>
     </w:p>
     <w:p>
@@ -407,7 +407,7 @@
           <w:szCs w:val="24"/>
           <w:rtl w:val="false"/>
         </w:rPr>
-        <w:t xml:space="preserve">Implemented least-privilege Entra federation and lazy Connect-user lifecycle management, separating call access from diagnostics and administration without individual AWS accounts or a SAML application.</w:t>
+        <w:t xml:space="preserve">Created a Go integration gateway that normalized vendor events across Intercom and Zendesk, supporting the first B2B support-AI demonstration.</w:t>
       </w:r>
     </w:p>
     <w:p>
@@ -428,7 +428,7 @@
           <w:szCs w:val="24"/>
           <w:rtl w:val="false"/>
         </w:rPr>
-        <w:t xml:space="preserve">Built a Go helpdesk gateway with vendor-neutral events, Intercom and Zendesk adapters and SQS queues, enabling the support-AI product’s first B2B demonstration.</w:t>
+        <w:t xml:space="preserve">Made support-ticket processing resilient during dependency degradation through partial-success reporting and recoverable scans.</w:t>
       </w:r>
     </w:p>
     <w:p>
@@ -449,7 +449,75 @@
           <w:szCs w:val="24"/>
           <w:rtl w:val="false"/>
         </w:rPr>
-        <w:t xml:space="preserve">Made Intercom ticket processing resilient with partial-success reporting and sharded cursor scans, retaining visibility of incomplete work during dependency degradation.</w:t>
+        <w:t xml:space="preserve">Automated GDPR export requests across seven sources through a self-service administrative flow.</w:t>
+      </w:r>
+    </w:p>
+    <w:p>
+      <w:pPr>
+        <w:bidi w:val="false"/>
+        <w:spacing w:after="120" w:before="120" w:line="259.20000000000005"/>
+        <w:jc w:val="left"/>
+      </w:pPr>
+      <w:r>
+        <w:rPr>
+          <w:rFonts w:ascii="Aptos" w:cs="Aptos" w:eastAsia="Aptos" w:hAnsi="Aptos"/>
+          <w:b/>
+          <w:bCs/>
+          <w:color w:val="000000"/>
+          <w:sz w:val="24"/>
+          <w:szCs w:val="24"/>
+          <w:rtl w:val="false"/>
+        </w:rPr>
+        <w:t xml:space="preserve">Technologies:</w:t>
+      </w:r>
+      <w:r>
+        <w:rPr>
+          <w:rFonts w:ascii="Aptos" w:cs="Aptos" w:eastAsia="Aptos" w:hAnsi="Aptos"/>
+          <w:color w:val="000000"/>
+          <w:sz w:val="24"/>
+          <w:szCs w:val="24"/>
+          <w:rtl w:val="false"/>
+        </w:rPr>
+        <w:t xml:space="preserve"> Go, PHP, PostgreSQL, AWS, Amazon Connect, SQS, Kubernetes, Intercom API, Zendesk API</w:t>
+      </w:r>
+    </w:p>
+    <w:p>
+      <w:pPr>
+        <w:pStyle w:val="3"/>
+        <w:pStyle w:val="Heading3"/>
+        <w:bidi w:val="false"/>
+        <w:spacing w:after="120" w:before="240"/>
+        <w:keepNext/>
+      </w:pPr>
+      <w:bookmarkStart w:name="_Toc_CRURATED_PHP_Software_Developer_concurre_6" w:id="1"/>
+      <w:r>
+        <w:rPr>
+          <w:rFonts w:ascii="Aptos" w:cs="Aptos" w:eastAsia="Aptos" w:hAnsi="Aptos"/>
+          <w:color w:val="000000"/>
+          <w:sz w:val="24"/>
+          <w:szCs w:val="24"/>
+          <w:rtl w:val="false"/>
+        </w:rPr>
+        <w:t xml:space="preserve">CRURATED — PHP Software Developer, concurrent part-time subcontract</w:t>
+      </w:r>
+      <w:bookmarkEnd w:id="1"/>
+    </w:p>
+    <w:p>
+      <w:pPr>
+        <w:bidi w:val="false"/>
+        <w:spacing w:after="120" w:before="120" w:line="259.20000000000005"/>
+        <w:jc w:val="left"/>
+        <w:keepNext/>
+      </w:pPr>
+      <w:r>
+        <w:rPr>
+          <w:rFonts w:ascii="Aptos" w:cs="Aptos" w:eastAsia="Aptos" w:hAnsi="Aptos"/>
+          <w:color w:val="000000"/>
+          <w:sz w:val="24"/>
+          <w:szCs w:val="24"/>
+          <w:rtl w:val="false"/>
+        </w:rPr>
+        <w:t xml:space="preserve">August 2024 – January 2026</w:t>
       </w:r>
     </w:p>
     <w:p>
@@ -470,75 +538,7 @@
           <w:szCs w:val="24"/>
           <w:rtl w:val="false"/>
         </w:rPr>
-        <w:t xml:space="preserve">Delivered self-service GDPR exports across seven data sources with request creation, status tracking and review.</w:t>
-      </w:r>
-    </w:p>
-    <w:p>
-      <w:pPr>
-        <w:bidi w:val="false"/>
-        <w:spacing w:after="120" w:before="120" w:line="259.20000000000005"/>
-        <w:jc w:val="left"/>
-      </w:pPr>
-      <w:r>
-        <w:rPr>
-          <w:rFonts w:ascii="Aptos" w:cs="Aptos" w:eastAsia="Aptos" w:hAnsi="Aptos"/>
-          <w:b/>
-          <w:bCs/>
-          <w:color w:val="000000"/>
-          <w:sz w:val="24"/>
-          <w:szCs w:val="24"/>
-          <w:rtl w:val="false"/>
-        </w:rPr>
-        <w:t xml:space="preserve">Technologies:</w:t>
-      </w:r>
-      <w:r>
-        <w:rPr>
-          <w:rFonts w:ascii="Aptos" w:cs="Aptos" w:eastAsia="Aptos" w:hAnsi="Aptos"/>
-          <w:color w:val="000000"/>
-          <w:sz w:val="24"/>
-          <w:szCs w:val="24"/>
-          <w:rtl w:val="false"/>
-        </w:rPr>
-        <w:t xml:space="preserve"> Go, PHP, PostgreSQL, AWS, Amazon Connect, SQS, Intercom API, Zendesk API, REST APIs</w:t>
-      </w:r>
-    </w:p>
-    <w:p>
-      <w:pPr>
-        <w:pStyle w:val="3"/>
-        <w:pStyle w:val="Heading3"/>
-        <w:bidi w:val="false"/>
-        <w:spacing w:after="120" w:before="240"/>
-        <w:keepNext/>
-      </w:pPr>
-      <w:bookmarkStart w:name="_Toc_CRURATED_PHP_Software_Developer_concurre_6" w:id="1"/>
-      <w:r>
-        <w:rPr>
-          <w:rFonts w:ascii="Aptos" w:cs="Aptos" w:eastAsia="Aptos" w:hAnsi="Aptos"/>
-          <w:color w:val="000000"/>
-          <w:sz w:val="24"/>
-          <w:szCs w:val="24"/>
-          <w:rtl w:val="false"/>
-        </w:rPr>
-        <w:t xml:space="preserve">CRURATED — PHP Software Developer, concurrent part-time consulting engagement</w:t>
-      </w:r>
-      <w:bookmarkEnd w:id="1"/>
-    </w:p>
-    <w:p>
-      <w:pPr>
-        <w:bidi w:val="false"/>
-        <w:spacing w:after="120" w:before="120" w:line="259.20000000000005"/>
-        <w:jc w:val="left"/>
-        <w:keepNext/>
-      </w:pPr>
-      <w:r>
-        <w:rPr>
-          <w:rFonts w:ascii="Aptos" w:cs="Aptos" w:eastAsia="Aptos" w:hAnsi="Aptos"/>
-          <w:color w:val="000000"/>
-          <w:sz w:val="24"/>
-          <w:szCs w:val="24"/>
-          <w:rtl w:val="false"/>
-        </w:rPr>
-        <w:t xml:space="preserve">August 2024 – January 2026</w:t>
+        <w:t xml:space="preserve">Built modular PHP event-stream delivery for production analytics, cutting new-stream setup from several days to under four hours.</w:t>
       </w:r>
     </w:p>
     <w:p>
@@ -559,7 +559,7 @@
           <w:szCs w:val="24"/>
           <w:rtl w:val="false"/>
         </w:rPr>
-        <w:t xml:space="preserve">Built modular event-stream architecture for production analytics, reducing the setup of a new stream from several days to under four hours.</w:t>
+        <w:t xml:space="preserve">Sustained event delivery above 99.9% with fault-tolerant routing, retries and production monitoring.</w:t>
       </w:r>
     </w:p>
     <w:p>
@@ -580,7 +580,7 @@
           <w:szCs w:val="24"/>
           <w:rtl w:val="false"/>
         </w:rPr>
-        <w:t xml:space="preserve">Maintained event delivery above 99.9% through retry design, fault-tolerant routing and operational monitoring.</w:t>
+        <w:t xml:space="preserve">Established versioned event schemas with parallel publishing, allowing downstream consumers to move between versions without halting new data.</w:t>
       </w:r>
     </w:p>
     <w:p>
@@ -601,7 +601,7 @@
           <w:szCs w:val="24"/>
           <w:rtl w:val="false"/>
         </w:rPr>
-        <w:t xml:space="preserve">Designed versioned event contracts and parallel publication so consumers could migrate without preventing delivery of new event data.</w:t>
+        <w:t xml:space="preserve">Took technical ownership of a production partner connection spanning authentication, account linking, collection import/export and purchase verification.</w:t>
       </w:r>
     </w:p>
     <w:p>
@@ -622,7 +622,7 @@
           <w:szCs w:val="24"/>
           <w:rtl w:val="false"/>
         </w:rPr>
-        <w:t xml:space="preserve">Owned a production partner integration covering authentication, OTP, account linking and request/response logging.</w:t>
+        <w:t xml:space="preserve">Increased DataLake throughput by more than tenfold under documented technical ownership.</w:t>
       </w:r>
     </w:p>
     <w:p>
@@ -662,16 +662,16 @@
         <w:spacing w:after="120" w:before="240"/>
         <w:keepNext/>
       </w:pPr>
-      <w:bookmarkStart w:name="_Toc_airSlate_Software_Developer_Programming__7" w:id="1"/>
-      <w:r>
-        <w:rPr>
-          <w:rFonts w:ascii="Aptos" w:cs="Aptos" w:eastAsia="Aptos" w:hAnsi="Aptos"/>
-          <w:color w:val="000000"/>
-          <w:sz w:val="24"/>
-          <w:szCs w:val="24"/>
-          <w:rtl w:val="false"/>
-        </w:rPr>
-        <w:t xml:space="preserve">airSlate — Software Developer / Programming Team Lead</w:t>
+      <w:bookmarkStart w:name="_Toc_airSlate_Software_Developer_7" w:id="1"/>
+      <w:r>
+        <w:rPr>
+          <w:rFonts w:ascii="Aptos" w:cs="Aptos" w:eastAsia="Aptos" w:hAnsi="Aptos"/>
+          <w:color w:val="000000"/>
+          <w:sz w:val="24"/>
+          <w:szCs w:val="24"/>
+          <w:rtl w:val="false"/>
+        </w:rPr>
+        <w:t xml:space="preserve">airSlate — Software Developer</w:t>
       </w:r>
       <w:bookmarkEnd w:id="1"/>
     </w:p>
@@ -711,7 +711,7 @@
           <w:szCs w:val="24"/>
           <w:rtl w:val="false"/>
         </w:rPr>
-        <w:t xml:space="preserve">Removed database bottlenecks and redistributed workload, reducing peak pressure on the main database and improving service stability during heavy traffic.</w:t>
+        <w:t xml:space="preserve">Improved high-traffic service stability by removing main-database bottlenecks and redistributing workload.</w:t>
       </w:r>
     </w:p>
     <w:p>
@@ -732,7 +732,7 @@
           <w:szCs w:val="24"/>
           <w:rtl w:val="false"/>
         </w:rPr>
-        <w:t xml:space="preserve">Introduced a Laravel/Symfony logger package aligned with the product’s interservice communication standard, creating a shared service-level logging component.</w:t>
+        <w:t xml:space="preserve">Developed a shared Laravel/Symfony logging package that followed the product's interservice communication standard.</w:t>
       </w:r>
     </w:p>
     <w:p>
@@ -835,7 +835,7 @@
           <w:szCs w:val="24"/>
           <w:rtl w:val="false"/>
         </w:rPr>
-        <w:t xml:space="preserve">Ukrainian (native), English (upper-intermediate), Italian (learning)</w:t>
+        <w:t xml:space="preserve">Ukrainian (native), English (upper-intermediate)</w:t>
       </w:r>
     </w:p>
     <w:sectPr>

</xml_diff>